<commit_message>
TV2: Cap nhat MSSV cua Tran The Tung va Nguyen Dinh Phan Anh
</commit_message>
<xml_diff>
--- a/Bao_cao_Hang_khong.docx
+++ b/Bao_cao_Hang_khong.docx
@@ -143,7 +143,7 @@
           </w:tcPr>
           <w:p>
             <w:r>
-              <w:t>MSSV: .........</w:t>
+              <w:t>11258756</w:t>
             </w:r>
           </w:p>
         </w:tc>
@@ -246,7 +246,7 @@
           </w:tcPr>
           <w:p>
             <w:r>
-              <w:t>MSSV: .........</w:t>
+              <w:t>11250492</w:t>
             </w:r>
           </w:p>
         </w:tc>

</xml_diff>